<commit_message>
Organiza TG2: manuscrito, evidencia, reproduccion y entrega
</commit_message>
<xml_diff>
--- a/Documentos/01-Manuscrito/plantilla-referencia.docx
+++ b/Documentos/01-Manuscrito/plantilla-referencia.docx
@@ -317,6 +317,8 @@
       <w:footnotePr>
         <w:numRestart w:val="eachSect"/>
       </w:footnotePr>
+      <w:pgSz w:w="12240" w:h="15840"/>
+      <w:pgMar w:top="1440" w:right="1440" w:bottom="1440" w:left="1440" w:header="720" w:footer="720" w:gutter="0"/>
     </w:sectPr>
   </w:body>
 </w:document>
@@ -485,15 +487,16 @@
   <w:docDefaults>
     <w:rPrDefault>
       <w:rPr>
-        <w:rFonts w:asciiTheme="minorHAnsi" w:eastAsiaTheme="minorEastAsia" w:hAnsiTheme="minorHAnsi" w:cstheme="minorBidi"/>
+        <w:rFonts w:ascii="Times New Roman" w:hAnsi="Times New Roman" w:eastAsia="Times New Roman" w:cs="Times New Roman"/>
         <w:sz w:val="24"/>
         <w:szCs w:val="24"/>
         <w:lang w:val="es-CO" w:eastAsia="zh-CN" w:bidi="ar-SA"/>
+        <w:color w:val="000000"/>
       </w:rPr>
     </w:rPrDefault>
     <w:pPrDefault>
       <w:pPr>
-        <w:spacing w:after="200" w:line="360" w:lineRule="auto"/>
+        <w:spacing w:after="120" w:line="360" w:lineRule="auto"/>
       </w:pPr>
     </w:pPrDefault>
   </w:docDefaults>
@@ -501,6 +504,17 @@
   <w:style w:type="paragraph" w:default="1" w:styleId="Normal">
     <w:name w:val="Normal"/>
     <w:qFormat/>
+    <w:rPr>
+      <w:rFonts w:ascii="Times New Roman" w:hAnsi="Times New Roman" w:eastAsia="Times New Roman" w:cs="Times New Roman"/>
+      <w:sz w:val="24"/>
+      <w:szCs w:val="24"/>
+      <w:color w:val="000000"/>
+    </w:rPr>
+    <w:pPr>
+      <w:widowControl/>
+      <w:spacing w:before="0" w:after="120" w:line="360" w:lineRule="auto"/>
+      <w:jc w:val="both"/>
+    </w:pPr>
   </w:style>
   <w:style w:type="paragraph" w:styleId="BodyText">
     <w:name w:val="Body Text"/>
@@ -508,22 +522,49 @@
     <w:link w:val="BodyTextChar"/>
     <w:qFormat/>
     <w:pPr>
-      <w:spacing w:before="180" w:after="180"/>
-    </w:pPr>
+      <w:spacing w:before="0" w:after="120" w:line="360" w:lineRule="auto"/>
+      <w:widowControl/>
+      <w:jc w:val="both"/>
+    </w:pPr>
+    <w:rPr>
+      <w:rFonts w:ascii="Times New Roman" w:hAnsi="Times New Roman" w:eastAsia="Times New Roman" w:cs="Times New Roman"/>
+      <w:sz w:val="24"/>
+      <w:szCs w:val="24"/>
+      <w:color w:val="000000"/>
+    </w:rPr>
   </w:style>
   <w:style w:type="paragraph" w:customStyle="1" w:styleId="FirstParagraph">
     <w:name w:val="First Paragraph"/>
     <w:basedOn w:val="BodyText"/>
     <w:next w:val="BodyText"/>
     <w:qFormat/>
+    <w:rPr>
+      <w:rFonts w:ascii="Times New Roman" w:hAnsi="Times New Roman" w:eastAsia="Times New Roman" w:cs="Times New Roman"/>
+      <w:sz w:val="24"/>
+      <w:szCs w:val="24"/>
+      <w:color w:val="000000"/>
+    </w:rPr>
+    <w:pPr>
+      <w:widowControl/>
+      <w:spacing w:before="0" w:after="120" w:line="360" w:lineRule="auto"/>
+      <w:jc w:val="both"/>
+    </w:pPr>
   </w:style>
   <w:style w:type="paragraph" w:customStyle="1" w:styleId="Compact">
     <w:name w:val="Compact"/>
     <w:basedOn w:val="BodyText"/>
     <w:qFormat/>
     <w:pPr>
-      <w:spacing w:before="36" w:after="36"/>
-    </w:pPr>
+      <w:spacing w:before="0" w:after="120" w:line="360" w:lineRule="auto"/>
+      <w:widowControl/>
+      <w:jc w:val="both"/>
+    </w:pPr>
+    <w:rPr>
+      <w:rFonts w:ascii="Times New Roman" w:hAnsi="Times New Roman" w:eastAsia="Times New Roman" w:cs="Times New Roman"/>
+      <w:sz w:val="24"/>
+      <w:szCs w:val="24"/>
+      <w:color w:val="000000"/>
+    </w:rPr>
   </w:style>
   <w:style w:type="paragraph" w:styleId="Title">
     <w:name w:val="Title"/>
@@ -534,14 +575,16 @@
     <w:qFormat/>
     <w:rsid w:val="00A10FD9"/>
     <w:pPr>
-      <w:spacing w:after="80" w:line="240" w:lineRule="auto"/>
+      <w:spacing w:after="240" w:line="360" w:lineRule="auto" w:before="240"/>
       <w:contextualSpacing/>
       <w:jc w:val="center"/>
-    </w:pPr>
-    <w:rPr>
-      <w:rFonts w:asciiTheme="majorHAnsi" w:eastAsiaTheme="majorEastAsia" w:hAnsiTheme="majorHAnsi" w:cstheme="majorBidi"/>
-      <w:sz w:val="56"/>
-      <w:szCs w:val="56"/>
+      <w:widowControl/>
+    </w:pPr>
+    <w:rPr>
+      <w:rFonts w:ascii="Times New Roman" w:hAnsi="Times New Roman" w:eastAsia="Times New Roman" w:cs="Times New Roman"/>
+      <w:sz w:val="36"/>
+      <w:szCs w:val="36"/>
+      <w:color w:val="000000"/>
     </w:rPr>
   </w:style>
   <w:style w:type="character" w:customStyle="1" w:styleId="TitleChar">
@@ -551,9 +594,10 @@
     <w:uiPriority w:val="10"/>
     <w:rsid w:val="00A10FD9"/>
     <w:rPr>
-      <w:rFonts w:asciiTheme="majorHAnsi" w:eastAsiaTheme="majorEastAsia" w:hAnsiTheme="majorHAnsi" w:cstheme="majorBidi"/>
-      <w:sz w:val="56"/>
-      <w:szCs w:val="56"/>
+      <w:rFonts w:ascii="Times New Roman" w:hAnsi="Times New Roman" w:eastAsia="Times New Roman" w:cs="Times New Roman"/>
+      <w:sz w:val="24"/>
+      <w:szCs w:val="24"/>
+      <w:color w:val="000000"/>
     </w:rPr>
   </w:style>
   <w:style w:type="paragraph" w:styleId="Subtitle">
@@ -568,12 +612,16 @@
       <w:numPr>
         <w:ilvl w:val="1"/>
       </w:numPr>
-    </w:pPr>
-    <w:rPr>
-      <w:rFonts w:eastAsiaTheme="majorEastAsia" w:cstheme="majorBidi"/>
+      <w:widowControl/>
+      <w:jc w:val="center"/>
+      <w:spacing w:before="240" w:after="240" w:line="360" w:lineRule="auto"/>
+    </w:pPr>
+    <w:rPr>
+      <w:rFonts w:ascii="Times New Roman" w:hAnsi="Times New Roman" w:eastAsia="Times New Roman" w:cs="Times New Roman"/>
       <w:spacing w:val="15"/>
-      <w:sz w:val="28"/>
-      <w:szCs w:val="28"/>
+      <w:sz w:val="24"/>
+      <w:szCs w:val="24"/>
+      <w:color w:val="000000"/>
     </w:rPr>
   </w:style>
   <w:style w:type="character" w:customStyle="1" w:styleId="SubtitleChar">
@@ -583,11 +631,11 @@
     <w:uiPriority w:val="11"/>
     <w:rsid w:val="00A10FD9"/>
     <w:rPr>
-      <w:rFonts w:eastAsiaTheme="majorEastAsia" w:cstheme="majorBidi"/>
-      <w:color w:val="595959" w:themeColor="text1" w:themeTint="A6"/>
+      <w:rFonts w:ascii="Times New Roman" w:hAnsi="Times New Roman" w:eastAsia="Times New Roman" w:cs="Times New Roman"/>
+      <w:color w:val="000000"/>
       <w:spacing w:val="15"/>
-      <w:sz w:val="28"/>
-      <w:szCs w:val="28"/>
+      <w:sz w:val="24"/>
+      <w:szCs w:val="24"/>
     </w:rPr>
   </w:style>
   <w:style w:type="paragraph" w:customStyle="1" w:styleId="Author">
@@ -598,10 +646,15 @@
     <w:pPr>
       <w:keepNext/>
       <w:keepLines/>
-    </w:pPr>
-    <w:rPr>
-      <w:sz w:val="24"/>
-      <w:szCs w:val="24"/>
+      <w:widowControl/>
+      <w:jc w:val="center"/>
+      <w:spacing w:before="240" w:after="240" w:line="360" w:lineRule="auto"/>
+    </w:pPr>
+    <w:rPr>
+      <w:sz w:val="24"/>
+      <w:szCs w:val="24"/>
+      <w:rFonts w:ascii="Times New Roman" w:hAnsi="Times New Roman" w:eastAsia="Times New Roman" w:cs="Times New Roman"/>
+      <w:color w:val="000000"/>
     </w:rPr>
   </w:style>
   <w:style w:type="paragraph" w:styleId="Date">
@@ -612,10 +665,15 @@
     <w:pPr>
       <w:keepNext/>
       <w:keepLines/>
-    </w:pPr>
-    <w:rPr>
-      <w:sz w:val="24"/>
-      <w:szCs w:val="24"/>
+      <w:widowControl/>
+      <w:jc w:val="center"/>
+      <w:spacing w:before="240" w:after="240" w:line="360" w:lineRule="auto"/>
+    </w:pPr>
+    <w:rPr>
+      <w:sz w:val="24"/>
+      <w:szCs w:val="24"/>
+      <w:rFonts w:ascii="Times New Roman" w:hAnsi="Times New Roman" w:eastAsia="Times New Roman" w:cs="Times New Roman"/>
+      <w:color w:val="000000"/>
     </w:rPr>
   </w:style>
   <w:style w:type="paragraph" w:customStyle="1" w:styleId="AbstractTitle">
@@ -628,11 +686,14 @@
       <w:keepLines/>
       <w:spacing w:before="300" w:after="0"/>
       <w:jc w:val="center"/>
+      <w:widowControl/>
     </w:pPr>
     <w:rPr>
       <w:b/>
-      <w:sz w:val="20"/>
-      <w:szCs w:val="20"/>
+      <w:sz w:val="24"/>
+      <w:szCs w:val="24"/>
+      <w:rFonts w:ascii="Times New Roman" w:hAnsi="Times New Roman" w:eastAsia="Times New Roman" w:cs="Times New Roman"/>
+      <w:color w:val="000000"/>
     </w:rPr>
   </w:style>
   <w:style w:type="paragraph" w:customStyle="1" w:styleId="Abstract">
@@ -644,10 +705,13 @@
       <w:keepNext/>
       <w:keepLines/>
       <w:spacing w:before="100" w:after="300"/>
-    </w:pPr>
-    <w:rPr>
-      <w:sz w:val="20"/>
-      <w:szCs w:val="20"/>
+      <w:widowControl/>
+    </w:pPr>
+    <w:rPr>
+      <w:sz w:val="24"/>
+      <w:szCs w:val="24"/>
+      <w:rFonts w:ascii="Times New Roman" w:hAnsi="Times New Roman" w:eastAsia="Times New Roman" w:cs="Times New Roman"/>
+      <w:color w:val="000000"/>
     </w:rPr>
   </w:style>
   <w:style w:type="paragraph" w:styleId="Bibliography">
@@ -655,8 +719,15 @@
     <w:basedOn w:val="Normal"/>
     <w:next w:val="Bibliography"/>
     <w:qFormat/>
-    <w:pPr/>
-    <w:rPr/>
+    <w:pPr>
+      <w:widowControl/>
+    </w:pPr>
+    <w:rPr>
+      <w:rFonts w:ascii="Times New Roman" w:hAnsi="Times New Roman" w:eastAsia="Times New Roman" w:cs="Times New Roman"/>
+      <w:sz w:val="24"/>
+      <w:szCs w:val="24"/>
+      <w:color w:val="000000"/>
+    </w:rPr>
   </w:style>
   <w:style w:type="paragraph" w:styleId="Heading1">
     <w:name w:val="heading 1"/>
@@ -669,14 +740,18 @@
     <w:pPr>
       <w:keepNext/>
       <w:keepLines/>
-      <w:spacing w:before="360" w:after="80"/>
+      <w:spacing w:before="240" w:after="120" w:line="360" w:lineRule="auto"/>
       <w:outlineLvl w:val="0"/>
-    </w:pPr>
-    <w:rPr>
-      <w:rFonts w:asciiTheme="majorHAnsi" w:eastAsiaTheme="majorEastAsia" w:hAnsiTheme="majorHAnsi" w:cstheme="majorBidi"/>
-      <w:color w:val="0F4761" w:themeColor="accent1" w:themeShade="BF"/>
-      <w:sz w:val="40"/>
-      <w:szCs w:val="40"/>
+      <w:widowControl/>
+      <w:jc w:val="left"/>
+      <w:pageBreakBefore/>
+    </w:pPr>
+    <w:rPr>
+      <w:rFonts w:ascii="Times New Roman" w:hAnsi="Times New Roman" w:eastAsia="Times New Roman" w:cs="Times New Roman"/>
+      <w:color w:val="000000"/>
+      <w:sz w:val="28"/>
+      <w:szCs w:val="28"/>
+      <w:b/>
     </w:rPr>
   </w:style>
   <w:style w:type="paragraph" w:styleId="Heading2">
@@ -692,14 +767,17 @@
     <w:pPr>
       <w:keepNext/>
       <w:keepLines/>
-      <w:spacing w:before="160" w:after="80"/>
+      <w:spacing w:before="240" w:after="120" w:line="360" w:lineRule="auto"/>
       <w:outlineLvl w:val="1"/>
-    </w:pPr>
-    <w:rPr>
-      <w:rFonts w:asciiTheme="majorHAnsi" w:eastAsiaTheme="majorEastAsia" w:hAnsiTheme="majorHAnsi" w:cstheme="majorBidi"/>
-      <w:color w:val="0F4761" w:themeColor="accent1" w:themeShade="BF"/>
-      <w:sz w:val="32"/>
-      <w:szCs w:val="32"/>
+      <w:widowControl/>
+      <w:jc w:val="left"/>
+    </w:pPr>
+    <w:rPr>
+      <w:rFonts w:ascii="Times New Roman" w:hAnsi="Times New Roman" w:eastAsia="Times New Roman" w:cs="Times New Roman"/>
+      <w:color w:val="000000"/>
+      <w:sz w:val="24"/>
+      <w:szCs w:val="24"/>
+      <w:b/>
     </w:rPr>
   </w:style>
   <w:style w:type="paragraph" w:styleId="Heading3">
@@ -715,14 +793,17 @@
     <w:pPr>
       <w:keepNext/>
       <w:keepLines/>
-      <w:spacing w:before="160" w:after="80"/>
+      <w:spacing w:before="240" w:after="120" w:line="360" w:lineRule="auto"/>
       <w:outlineLvl w:val="2"/>
-    </w:pPr>
-    <w:rPr>
-      <w:rFonts w:eastAsiaTheme="majorEastAsia" w:cstheme="majorBidi"/>
-      <w:color w:val="0F4761" w:themeColor="accent1" w:themeShade="BF"/>
-      <w:sz w:val="28"/>
-      <w:szCs w:val="28"/>
+      <w:widowControl/>
+      <w:jc w:val="left"/>
+    </w:pPr>
+    <w:rPr>
+      <w:rFonts w:ascii="Times New Roman" w:hAnsi="Times New Roman" w:eastAsia="Times New Roman" w:cs="Times New Roman"/>
+      <w:color w:val="000000"/>
+      <w:sz w:val="24"/>
+      <w:szCs w:val="24"/>
+      <w:b/>
     </w:rPr>
   </w:style>
   <w:style w:type="paragraph" w:styleId="Heading4">
@@ -738,14 +819,19 @@
     <w:pPr>
       <w:keepNext/>
       <w:keepLines/>
-      <w:spacing w:before="80" w:after="40"/>
+      <w:spacing w:before="240" w:after="120" w:line="360" w:lineRule="auto"/>
       <w:outlineLvl w:val="3"/>
-    </w:pPr>
-    <w:rPr>
-      <w:rFonts w:eastAsiaTheme="majorEastAsia" w:cstheme="majorBidi"/>
+      <w:widowControl/>
+      <w:jc w:val="left"/>
+    </w:pPr>
+    <w:rPr>
+      <w:rFonts w:ascii="Times New Roman" w:hAnsi="Times New Roman" w:eastAsia="Times New Roman" w:cs="Times New Roman"/>
       <w:i/>
       <w:iCs/>
-      <w:color w:val="0F4761" w:themeColor="accent1" w:themeShade="BF"/>
+      <w:color w:val="000000"/>
+      <w:sz w:val="24"/>
+      <w:szCs w:val="24"/>
+      <w:b/>
     </w:rPr>
   </w:style>
   <w:style w:type="paragraph" w:styleId="Heading5">
@@ -761,12 +847,17 @@
     <w:pPr>
       <w:keepNext/>
       <w:keepLines/>
-      <w:spacing w:before="80" w:after="40"/>
+      <w:spacing w:before="240" w:after="120" w:line="360" w:lineRule="auto"/>
       <w:outlineLvl w:val="4"/>
-    </w:pPr>
-    <w:rPr>
-      <w:rFonts w:eastAsiaTheme="majorEastAsia" w:cstheme="majorBidi"/>
-      <w:color w:val="0F4761" w:themeColor="accent1" w:themeShade="BF"/>
+      <w:widowControl/>
+      <w:jc w:val="left"/>
+    </w:pPr>
+    <w:rPr>
+      <w:rFonts w:ascii="Times New Roman" w:hAnsi="Times New Roman" w:eastAsia="Times New Roman" w:cs="Times New Roman"/>
+      <w:color w:val="000000"/>
+      <w:sz w:val="24"/>
+      <w:szCs w:val="24"/>
+      <w:b/>
     </w:rPr>
   </w:style>
   <w:style w:type="paragraph" w:styleId="Heading6">
@@ -782,14 +873,19 @@
     <w:pPr>
       <w:keepNext/>
       <w:keepLines/>
-      <w:spacing w:before="40" w:after="0"/>
+      <w:spacing w:before="240" w:after="120" w:line="360" w:lineRule="auto"/>
       <w:outlineLvl w:val="5"/>
-    </w:pPr>
-    <w:rPr>
-      <w:rFonts w:eastAsiaTheme="majorEastAsia" w:cstheme="majorBidi"/>
+      <w:widowControl/>
+      <w:jc w:val="left"/>
+    </w:pPr>
+    <w:rPr>
+      <w:rFonts w:ascii="Times New Roman" w:hAnsi="Times New Roman" w:eastAsia="Times New Roman" w:cs="Times New Roman"/>
       <w:i/>
       <w:iCs/>
-      <w:color w:val="595959" w:themeColor="text1" w:themeTint="A6"/>
+      <w:color w:val="000000"/>
+      <w:sz w:val="24"/>
+      <w:szCs w:val="24"/>
+      <w:b/>
     </w:rPr>
   </w:style>
   <w:style w:type="paragraph" w:styleId="Heading7">
@@ -805,12 +901,17 @@
     <w:pPr>
       <w:keepNext/>
       <w:keepLines/>
-      <w:spacing w:before="40" w:after="0"/>
+      <w:spacing w:before="240" w:after="120" w:line="360" w:lineRule="auto"/>
       <w:outlineLvl w:val="6"/>
-    </w:pPr>
-    <w:rPr>
-      <w:rFonts w:eastAsiaTheme="majorEastAsia" w:cstheme="majorBidi"/>
-      <w:color w:val="595959" w:themeColor="text1" w:themeTint="A6"/>
+      <w:widowControl/>
+      <w:jc w:val="left"/>
+    </w:pPr>
+    <w:rPr>
+      <w:rFonts w:ascii="Times New Roman" w:hAnsi="Times New Roman" w:eastAsia="Times New Roman" w:cs="Times New Roman"/>
+      <w:color w:val="000000"/>
+      <w:sz w:val="24"/>
+      <w:szCs w:val="24"/>
+      <w:b/>
     </w:rPr>
   </w:style>
   <w:style w:type="paragraph" w:styleId="Heading8">
@@ -826,14 +927,19 @@
     <w:pPr>
       <w:keepNext/>
       <w:keepLines/>
-      <w:spacing w:after="0"/>
+      <w:spacing w:after="120" w:before="240" w:line="360" w:lineRule="auto"/>
       <w:outlineLvl w:val="7"/>
-    </w:pPr>
-    <w:rPr>
-      <w:rFonts w:eastAsiaTheme="majorEastAsia" w:cstheme="majorBidi"/>
+      <w:widowControl/>
+      <w:jc w:val="left"/>
+    </w:pPr>
+    <w:rPr>
+      <w:rFonts w:ascii="Times New Roman" w:hAnsi="Times New Roman" w:eastAsia="Times New Roman" w:cs="Times New Roman"/>
       <w:i/>
       <w:iCs/>
-      <w:color w:val="272727" w:themeColor="text1" w:themeTint="D8"/>
+      <w:color w:val="000000"/>
+      <w:sz w:val="24"/>
+      <w:szCs w:val="24"/>
+      <w:b/>
     </w:rPr>
   </w:style>
   <w:style w:type="paragraph" w:styleId="Heading9">
@@ -849,12 +955,17 @@
     <w:pPr>
       <w:keepNext/>
       <w:keepLines/>
-      <w:spacing w:after="0"/>
+      <w:spacing w:after="120" w:before="240" w:line="360" w:lineRule="auto"/>
       <w:outlineLvl w:val="8"/>
-    </w:pPr>
-    <w:rPr>
-      <w:rFonts w:eastAsiaTheme="majorEastAsia" w:cstheme="majorBidi"/>
-      <w:color w:val="272727" w:themeColor="text1" w:themeTint="D8"/>
+      <w:widowControl/>
+      <w:jc w:val="left"/>
+    </w:pPr>
+    <w:rPr>
+      <w:rFonts w:ascii="Times New Roman" w:hAnsi="Times New Roman" w:eastAsia="Times New Roman" w:cs="Times New Roman"/>
+      <w:color w:val="000000"/>
+      <w:sz w:val="24"/>
+      <w:szCs w:val="24"/>
+      <w:b/>
     </w:rPr>
   </w:style>
   <w:style w:type="character" w:customStyle="1" w:styleId="Heading1Char">
@@ -864,10 +975,10 @@
     <w:uiPriority w:val="9"/>
     <w:rsid w:val="00A10FD9"/>
     <w:rPr>
-      <w:rFonts w:asciiTheme="majorHAnsi" w:eastAsiaTheme="majorEastAsia" w:hAnsiTheme="majorHAnsi" w:cstheme="majorBidi"/>
-      <w:color w:val="0F4761" w:themeColor="accent1" w:themeShade="BF"/>
-      <w:sz w:val="40"/>
-      <w:szCs w:val="40"/>
+      <w:rFonts w:ascii="Times New Roman" w:hAnsi="Times New Roman" w:eastAsia="Times New Roman" w:cs="Times New Roman"/>
+      <w:color w:val="000000"/>
+      <w:sz w:val="24"/>
+      <w:szCs w:val="24"/>
     </w:rPr>
   </w:style>
   <w:style w:type="character" w:customStyle="1" w:styleId="Heading2Char">
@@ -878,10 +989,10 @@
     <w:semiHidden/>
     <w:rsid w:val="00A10FD9"/>
     <w:rPr>
-      <w:rFonts w:asciiTheme="majorHAnsi" w:eastAsiaTheme="majorEastAsia" w:hAnsiTheme="majorHAnsi" w:cstheme="majorBidi"/>
-      <w:color w:val="0F4761" w:themeColor="accent1" w:themeShade="BF"/>
-      <w:sz w:val="32"/>
-      <w:szCs w:val="32"/>
+      <w:rFonts w:ascii="Times New Roman" w:hAnsi="Times New Roman" w:eastAsia="Times New Roman" w:cs="Times New Roman"/>
+      <w:color w:val="000000"/>
+      <w:sz w:val="24"/>
+      <w:szCs w:val="24"/>
     </w:rPr>
   </w:style>
   <w:style w:type="character" w:customStyle="1" w:styleId="Heading3Char">
@@ -892,10 +1003,10 @@
     <w:semiHidden/>
     <w:rsid w:val="00A10FD9"/>
     <w:rPr>
-      <w:rFonts w:eastAsiaTheme="majorEastAsia" w:cstheme="majorBidi"/>
-      <w:color w:val="0F4761" w:themeColor="accent1" w:themeShade="BF"/>
-      <w:sz w:val="28"/>
-      <w:szCs w:val="28"/>
+      <w:rFonts w:ascii="Times New Roman" w:hAnsi="Times New Roman" w:eastAsia="Times New Roman" w:cs="Times New Roman"/>
+      <w:color w:val="000000"/>
+      <w:sz w:val="24"/>
+      <w:szCs w:val="24"/>
     </w:rPr>
   </w:style>
   <w:style w:type="character" w:customStyle="1" w:styleId="Heading4Char">
@@ -906,10 +1017,12 @@
     <w:semiHidden/>
     <w:rsid w:val="00A10FD9"/>
     <w:rPr>
-      <w:rFonts w:eastAsiaTheme="majorEastAsia" w:cstheme="majorBidi"/>
+      <w:rFonts w:ascii="Times New Roman" w:hAnsi="Times New Roman" w:eastAsia="Times New Roman" w:cs="Times New Roman"/>
       <w:i/>
       <w:iCs/>
-      <w:color w:val="0F4761" w:themeColor="accent1" w:themeShade="BF"/>
+      <w:color w:val="000000"/>
+      <w:sz w:val="24"/>
+      <w:szCs w:val="24"/>
     </w:rPr>
   </w:style>
   <w:style w:type="character" w:customStyle="1" w:styleId="Heading5Char">
@@ -920,8 +1033,10 @@
     <w:semiHidden/>
     <w:rsid w:val="00A10FD9"/>
     <w:rPr>
-      <w:rFonts w:eastAsiaTheme="majorEastAsia" w:cstheme="majorBidi"/>
-      <w:color w:val="0F4761" w:themeColor="accent1" w:themeShade="BF"/>
+      <w:rFonts w:ascii="Times New Roman" w:hAnsi="Times New Roman" w:eastAsia="Times New Roman" w:cs="Times New Roman"/>
+      <w:color w:val="000000"/>
+      <w:sz w:val="24"/>
+      <w:szCs w:val="24"/>
     </w:rPr>
   </w:style>
   <w:style w:type="character" w:customStyle="1" w:styleId="Heading6Char">
@@ -932,10 +1047,12 @@
     <w:semiHidden/>
     <w:rsid w:val="00A10FD9"/>
     <w:rPr>
-      <w:rFonts w:eastAsiaTheme="majorEastAsia" w:cstheme="majorBidi"/>
+      <w:rFonts w:ascii="Times New Roman" w:hAnsi="Times New Roman" w:eastAsia="Times New Roman" w:cs="Times New Roman"/>
       <w:i/>
       <w:iCs/>
-      <w:color w:val="595959" w:themeColor="text1" w:themeTint="A6"/>
+      <w:color w:val="000000"/>
+      <w:sz w:val="24"/>
+      <w:szCs w:val="24"/>
     </w:rPr>
   </w:style>
   <w:style w:type="character" w:customStyle="1" w:styleId="Heading7Char">
@@ -946,8 +1063,10 @@
     <w:semiHidden/>
     <w:rsid w:val="00A10FD9"/>
     <w:rPr>
-      <w:rFonts w:eastAsiaTheme="majorEastAsia" w:cstheme="majorBidi"/>
-      <w:color w:val="595959" w:themeColor="text1" w:themeTint="A6"/>
+      <w:rFonts w:ascii="Times New Roman" w:hAnsi="Times New Roman" w:eastAsia="Times New Roman" w:cs="Times New Roman"/>
+      <w:color w:val="000000"/>
+      <w:sz w:val="24"/>
+      <w:szCs w:val="24"/>
     </w:rPr>
   </w:style>
   <w:style w:type="character" w:customStyle="1" w:styleId="Heading8Char">
@@ -958,10 +1077,12 @@
     <w:semiHidden/>
     <w:rsid w:val="00A10FD9"/>
     <w:rPr>
-      <w:rFonts w:eastAsiaTheme="majorEastAsia" w:cstheme="majorBidi"/>
+      <w:rFonts w:ascii="Times New Roman" w:hAnsi="Times New Roman" w:eastAsia="Times New Roman" w:cs="Times New Roman"/>
       <w:i/>
       <w:iCs/>
-      <w:color w:val="272727" w:themeColor="text1" w:themeTint="D8"/>
+      <w:color w:val="000000"/>
+      <w:sz w:val="24"/>
+      <w:szCs w:val="24"/>
     </w:rPr>
   </w:style>
   <w:style w:type="character" w:customStyle="1" w:styleId="Heading9Char">
@@ -972,8 +1093,10 @@
     <w:semiHidden/>
     <w:rsid w:val="00A10FD9"/>
     <w:rPr>
-      <w:rFonts w:eastAsiaTheme="majorEastAsia" w:cstheme="majorBidi"/>
-      <w:color w:val="272727" w:themeColor="text1" w:themeTint="D8"/>
+      <w:rFonts w:ascii="Times New Roman" w:hAnsi="Times New Roman" w:eastAsia="Times New Roman" w:cs="Times New Roman"/>
+      <w:color w:val="000000"/>
+      <w:sz w:val="24"/>
+      <w:szCs w:val="24"/>
     </w:rPr>
   </w:style>
   <w:style w:type="paragraph" w:styleId="BlockText">
@@ -986,7 +1109,14 @@
     <w:pPr>
       <w:spacing w:before="100" w:after="100"/>
       <w:ind w:firstLine="0" w:left="480" w:right="480"/>
-    </w:pPr>
+      <w:widowControl/>
+    </w:pPr>
+    <w:rPr>
+      <w:rFonts w:ascii="Times New Roman" w:hAnsi="Times New Roman" w:eastAsia="Times New Roman" w:cs="Times New Roman"/>
+      <w:sz w:val="24"/>
+      <w:szCs w:val="24"/>
+      <w:color w:val="000000"/>
+    </w:rPr>
   </w:style>
   <w:style w:type="paragraph" w:styleId="FootnoteText">
     <w:name w:val="Footnote Text"/>
@@ -995,6 +1125,15 @@
     <w:uiPriority w:val="9"/>
     <w:unhideWhenUsed/>
     <w:qFormat/>
+    <w:rPr>
+      <w:rFonts w:ascii="Times New Roman" w:hAnsi="Times New Roman" w:eastAsia="Times New Roman" w:cs="Times New Roman"/>
+      <w:sz w:val="24"/>
+      <w:szCs w:val="24"/>
+      <w:color w:val="000000"/>
+    </w:rPr>
+    <w:pPr>
+      <w:widowControl/>
+    </w:pPr>
   </w:style>
   <w:style w:type="paragraph" w:styleId="FootnoteBlockText">
     <w:name w:val="Footnote Block Text"/>
@@ -1006,12 +1145,25 @@
     <w:pPr>
       <w:spacing w:before="100" w:after="100"/>
       <w:ind w:firstLine="0" w:left="480" w:right="480"/>
-    </w:pPr>
+      <w:widowControl/>
+    </w:pPr>
+    <w:rPr>
+      <w:rFonts w:ascii="Times New Roman" w:hAnsi="Times New Roman" w:eastAsia="Times New Roman" w:cs="Times New Roman"/>
+      <w:sz w:val="24"/>
+      <w:szCs w:val="24"/>
+      <w:color w:val="000000"/>
+    </w:rPr>
   </w:style>
   <w:style w:type="character" w:default="1" w:styleId="DefaultParagraphFont">
     <w:name w:val="Default Paragraph Font"/>
     <w:semiHidden/>
     <w:unhideWhenUsed/>
+    <w:rPr>
+      <w:rFonts w:ascii="Times New Roman" w:hAnsi="Times New Roman" w:eastAsia="Times New Roman" w:cs="Times New Roman"/>
+      <w:sz w:val="24"/>
+      <w:szCs w:val="24"/>
+      <w:color w:val="000000"/>
+    </w:rPr>
   </w:style>
   <w:style w:type="table" w:default="1" w:styleId="Table">
     <w:name w:val="Table"/>
@@ -1045,14 +1197,28 @@
       <w:keepNext/>
       <w:keepLines/>
       <w:spacing w:after="0"/>
+      <w:widowControl/>
     </w:pPr>
     <w:rPr>
       <w:b/>
+      <w:rFonts w:ascii="Times New Roman" w:hAnsi="Times New Roman" w:eastAsia="Times New Roman" w:cs="Times New Roman"/>
+      <w:sz w:val="24"/>
+      <w:szCs w:val="24"/>
+      <w:color w:val="000000"/>
     </w:rPr>
   </w:style>
   <w:style w:type="paragraph" w:customStyle="1" w:styleId="Definition">
     <w:name w:val="Definition"/>
     <w:basedOn w:val="Normal"/>
+    <w:rPr>
+      <w:rFonts w:ascii="Times New Roman" w:hAnsi="Times New Roman" w:eastAsia="Times New Roman" w:cs="Times New Roman"/>
+      <w:sz w:val="24"/>
+      <w:szCs w:val="24"/>
+      <w:color w:val="000000"/>
+    </w:rPr>
+    <w:pPr>
+      <w:widowControl/>
+    </w:pPr>
   </w:style>
   <w:style w:type="paragraph" w:styleId="Caption">
     <w:name w:val="Caption"/>
@@ -1060,9 +1226,14 @@
     <w:link w:val="BodyTextChar"/>
     <w:pPr>
       <w:spacing w:before="0" w:after="120"/>
+      <w:widowControl/>
     </w:pPr>
     <w:rPr>
       <w:i/>
+      <w:rFonts w:ascii="Times New Roman" w:hAnsi="Times New Roman" w:eastAsia="Times New Roman" w:cs="Times New Roman"/>
+      <w:sz w:val="24"/>
+      <w:szCs w:val="24"/>
+      <w:color w:val="000000"/>
     </w:rPr>
   </w:style>
   <w:style w:type="paragraph" w:customStyle="1" w:styleId="TableCaption">
@@ -1070,52 +1241,105 @@
     <w:basedOn w:val="Caption"/>
     <w:pPr>
       <w:keepNext/>
-    </w:pPr>
+      <w:widowControl/>
+    </w:pPr>
+    <w:rPr>
+      <w:rFonts w:ascii="Times New Roman" w:hAnsi="Times New Roman" w:eastAsia="Times New Roman" w:cs="Times New Roman"/>
+      <w:sz w:val="24"/>
+      <w:szCs w:val="24"/>
+      <w:color w:val="000000"/>
+    </w:rPr>
   </w:style>
   <w:style w:type="paragraph" w:customStyle="1" w:styleId="ImageCaption">
     <w:name w:val="Image Caption"/>
     <w:basedOn w:val="Caption"/>
+    <w:rPr>
+      <w:rFonts w:ascii="Times New Roman" w:hAnsi="Times New Roman" w:eastAsia="Times New Roman" w:cs="Times New Roman"/>
+      <w:sz w:val="24"/>
+      <w:szCs w:val="24"/>
+      <w:color w:val="000000"/>
+    </w:rPr>
+    <w:pPr>
+      <w:widowControl/>
+    </w:pPr>
   </w:style>
   <w:style w:type="paragraph" w:customStyle="1" w:styleId="Figure">
     <w:name w:val="Figure"/>
     <w:basedOn w:val="Normal"/>
+    <w:rPr>
+      <w:rFonts w:ascii="Times New Roman" w:hAnsi="Times New Roman" w:eastAsia="Times New Roman" w:cs="Times New Roman"/>
+      <w:sz w:val="24"/>
+      <w:szCs w:val="24"/>
+      <w:color w:val="000000"/>
+    </w:rPr>
+    <w:pPr>
+      <w:widowControl/>
+    </w:pPr>
   </w:style>
   <w:style w:type="paragraph" w:customStyle="1" w:styleId="CaptionedFigure">
     <w:name w:val="Captioned Figure"/>
     <w:basedOn w:val="Figure"/>
     <w:pPr>
       <w:keepNext/>
-    </w:pPr>
+      <w:widowControl/>
+    </w:pPr>
+    <w:rPr>
+      <w:rFonts w:ascii="Times New Roman" w:hAnsi="Times New Roman" w:eastAsia="Times New Roman" w:cs="Times New Roman"/>
+      <w:sz w:val="24"/>
+      <w:szCs w:val="24"/>
+      <w:color w:val="000000"/>
+    </w:rPr>
   </w:style>
   <w:style w:type="character" w:customStyle="1" w:styleId="BodyTextChar">
     <w:name w:val="Body Text Char"/>
     <w:basedOn w:val="DefaultParagraphFont"/>
     <w:link w:val="BodyText"/>
+    <w:rPr>
+      <w:rFonts w:ascii="Times New Roman" w:hAnsi="Times New Roman" w:eastAsia="Times New Roman" w:cs="Times New Roman"/>
+      <w:sz w:val="24"/>
+      <w:szCs w:val="24"/>
+      <w:color w:val="000000"/>
+    </w:rPr>
   </w:style>
   <w:style w:type="character" w:customStyle="1" w:styleId="VerbatimChar">
     <w:name w:val="Verbatim Char"/>
     <w:basedOn w:val="BodyTextChar"/>
     <w:rPr>
-      <w:rFonts w:ascii="Consolas" w:hAnsi="Consolas"/>
-      <w:sz w:val="22"/>
+      <w:rFonts w:ascii="Times New Roman" w:hAnsi="Times New Roman" w:eastAsia="Times New Roman" w:cs="Times New Roman"/>
+      <w:sz w:val="24"/>
+      <w:szCs w:val="24"/>
+      <w:color w:val="000000"/>
     </w:rPr>
   </w:style>
   <w:style w:type="character" w:customStyle="1" w:styleId="SectionNumber">
     <w:name w:val="Section Number"/>
     <w:basedOn w:val="BodyTextChar"/>
+    <w:rPr>
+      <w:rFonts w:ascii="Times New Roman" w:hAnsi="Times New Roman" w:eastAsia="Times New Roman" w:cs="Times New Roman"/>
+      <w:sz w:val="24"/>
+      <w:szCs w:val="24"/>
+      <w:color w:val="000000"/>
+    </w:rPr>
   </w:style>
   <w:style w:type="character" w:styleId="FootnoteReference">
     <w:name w:val="Footnote Reference"/>
     <w:basedOn w:val="BodyTextChar"/>
     <w:rPr>
       <w:vertAlign w:val="superscript"/>
+      <w:rFonts w:ascii="Times New Roman" w:hAnsi="Times New Roman" w:eastAsia="Times New Roman" w:cs="Times New Roman"/>
+      <w:sz w:val="24"/>
+      <w:szCs w:val="24"/>
+      <w:color w:val="000000"/>
     </w:rPr>
   </w:style>
   <w:style w:type="character" w:styleId="Hyperlink">
     <w:name w:val="Hyperlink"/>
     <w:basedOn w:val="BodyTextChar"/>
     <w:rPr>
-      <w:color w:val="4F81BD" w:themeColor="accent1"/>
+      <w:color w:val="000000"/>
+      <w:rFonts w:ascii="Times New Roman" w:hAnsi="Times New Roman" w:eastAsia="Times New Roman" w:cs="Times New Roman"/>
+      <w:sz w:val="24"/>
+      <w:szCs w:val="24"/>
     </w:rPr>
   </w:style>
   <w:style w:type="paragraph" w:styleId="TOCHeading">
@@ -1128,12 +1352,17 @@
     <w:pPr>
       <w:spacing w:before="240" w:line="259" w:lineRule="auto"/>
       <w:outlineLvl w:val="9"/>
-    </w:pPr>
-    <w:rPr>
-      <w:rFonts w:asciiTheme="majorHAnsi" w:eastAsiaTheme="majorEastAsia" w:hAnsiTheme="majorHAnsi" w:cstheme="majorBidi"/>
+      <w:widowControl/>
+      <w:pageBreakBefore/>
+      <w:keepNext/>
+    </w:pPr>
+    <w:rPr>
+      <w:rFonts w:ascii="Times New Roman" w:hAnsi="Times New Roman" w:eastAsia="Times New Roman" w:cs="Times New Roman"/>
       <w:b w:val="0"/>
       <w:bCs w:val="0"/>
-      <w:color w:val="365F91" w:themeColor="accent1" w:themeShade="BF"/>
+      <w:color w:val="000000"/>
+      <w:sz w:val="24"/>
+      <w:szCs w:val="24"/>
     </w:rPr>
   </w:style>
 </w:styles>

</xml_diff>